<commit_message>
Align report decisions with missing evidence and actual product units
</commit_message>
<xml_diff>
--- a/samples/client_report_latest.docx
+++ b/samples/client_report_latest.docx
@@ -403,7 +403,7 @@
                 <w:rFonts w:ascii="IBM Plex Sans Arabic" w:hAnsi="IBM Plex Sans Arabic" w:cs="IBM Plex Sans Arabic"/>
                 <w:rtl/>
               </w:rPr>
-              <w:t>2026-08-26</w:t>
+              <w:t>2026-09-09</w:t>
             </w:r>
           </w:p>
         </w:tc>
@@ -4831,7 +4831,7 @@
           <w:rFonts w:ascii="IBM Plex Sans Arabic" w:hAnsi="IBM Plex Sans Arabic" w:cs="IBM Plex Sans Arabic"/>
           <w:rtl/>
         </w:rPr>
-        <w:t>تكلفة المصنع (‏EXW‏) غير مدخلة — أدخل سعر المصنع للكيلوغرام ليكتمل حساب سلسلة التكلفة حتى الرف</w:t>
+        <w:t>تكلفة المصنع (‏EXW‏) غير مدخلة — أدخل سعر المصنع للكيلوغرام لاستكمال أحد مدخلات سلسلة التكلفة حتى الرف</w:t>
       </w:r>
     </w:p>
     <w:p>
@@ -5545,7 +5545,7 @@
           <w:rFonts w:ascii="IBM Plex Sans Arabic" w:hAnsi="IBM Plex Sans Arabic" w:cs="IBM Plex Sans Arabic"/>
           <w:rtl/>
         </w:rPr>
-        <w:t>لحساب موقعك السعري الدقيق: سعر المصنع للكيلوغرام (التكلفة/كجم) هو المعطى الناقص الوحيد.</w:t>
+        <w:t>تتطلب المقارنة السعرية سعر المصنع وسعر المنافس بعملة ووحدة متطابقتين، مع توثيق حجم العبوة وأي تحويل مستخدم.</w:t>
       </w:r>
     </w:p>
     <w:p>
@@ -5948,6 +5948,188 @@
           <w:rtl/>
         </w:rPr>
         <w:t>لم نتمكّن من تأكيد قناة الدخول الأولى (موزّع أغذية حلال في أمستردام — مرشّح محتمل) من مصدر موثّق — إغلاق هذه الفجوة يتطلّب خدمة تحقّق جهات اتصال مدفوعة (قواعد بيانات تجارية) قبل الالتزام بالموزّع.</w:t>
+      </w:r>
+    </w:p>
+    <w:p>
+      <w:pPr>
+        <w:pStyle w:val="ListBullet"/>
+        <w:bidi/>
+        <w:jc w:val="start"/>
+      </w:pPr>
+      <w:r>
+        <w:rPr>
+          <w:rFonts w:ascii="IBM Plex Sans Arabic" w:hAnsi="IBM Plex Sans Arabic" w:cs="IBM Plex Sans Arabic"/>
+          <w:rtl/>
+        </w:rPr>
+        <w:t>لم يتحقّق بعد: التعاقد مع موزّع محلي مؤكَّد بالاسم في هولندا — إغلاق هذا الشرط يتطلّب التحقق من نشاط الجهة واهتمامها بالمنتج، ثم الاتفاق على شروط التوزيع وتوثيق العقد.</w:t>
+      </w:r>
+    </w:p>
+    <w:p>
+      <w:pPr>
+        <w:pStyle w:val="ListBullet"/>
+        <w:bidi/>
+        <w:jc w:val="start"/>
+      </w:pPr>
+      <w:r>
+        <w:rPr>
+          <w:rFonts w:ascii="IBM Plex Sans Arabic" w:hAnsi="IBM Plex Sans Arabic" w:cs="IBM Plex Sans Arabic"/>
+          <w:rtl/>
+        </w:rPr>
+        <w:t>لم يتحقّق بعد: استكمال بيانات معدّل نموّ الواردات وإعادة تقييم القرار — إغلاق هذا الشرط يتطلّب توثيق المدخلات من مصدر مناسب، ثم إعادة الحساب قبل الالتزام بالبيع.</w:t>
+      </w:r>
+    </w:p>
+    <w:p>
+      <w:pPr>
+        <w:pStyle w:val="ListBullet"/>
+        <w:bidi/>
+        <w:jc w:val="start"/>
+      </w:pPr>
+      <w:r>
+        <w:rPr>
+          <w:rFonts w:ascii="IBM Plex Sans Arabic" w:hAnsi="IBM Plex Sans Arabic" w:cs="IBM Plex Sans Arabic"/>
+          <w:rtl/>
+        </w:rPr>
+        <w:t>لم يتحقّق بعد: استكمال بيانات دخل الفرد وإعادة تقييم القرار — إغلاق هذا الشرط يتطلّب توثيق المدخلات من مصدر مناسب، ثم إعادة الحساب قبل الالتزام بالبيع.</w:t>
+      </w:r>
+    </w:p>
+    <w:p>
+      <w:pPr>
+        <w:pStyle w:val="ListBullet"/>
+        <w:bidi/>
+        <w:jc w:val="start"/>
+      </w:pPr>
+      <w:r>
+        <w:rPr>
+          <w:rFonts w:ascii="IBM Plex Sans Arabic" w:hAnsi="IBM Plex Sans Arabic" w:cs="IBM Plex Sans Arabic"/>
+          <w:rtl/>
+        </w:rPr>
+        <w:t>لم يتحقّق بعد: استكمال بيانات حصّة السعودية الحالية وإعادة تقييم القرار — إغلاق هذا الشرط يتطلّب توثيق المدخلات من مصدر مناسب، ثم إعادة الحساب قبل الالتزام بالبيع.</w:t>
+      </w:r>
+    </w:p>
+    <w:p>
+      <w:pPr>
+        <w:pStyle w:val="ListBullet"/>
+        <w:bidi/>
+        <w:jc w:val="start"/>
+      </w:pPr>
+      <w:r>
+        <w:rPr>
+          <w:rFonts w:ascii="IBM Plex Sans Arabic" w:hAnsi="IBM Plex Sans Arabic" w:cs="IBM Plex Sans Arabic"/>
+          <w:rtl/>
+        </w:rPr>
+        <w:t>لم يتحقّق بعد: استكمال بيانات حصّة المورّد الأكبر وإعادة تقييم القرار — إغلاق هذا الشرط يتطلّب توثيق المدخلات من مصدر مناسب، ثم إعادة الحساب قبل الالتزام بالبيع.</w:t>
+      </w:r>
+    </w:p>
+    <w:p>
+      <w:pPr>
+        <w:pStyle w:val="ListBullet"/>
+        <w:bidi/>
+        <w:jc w:val="start"/>
+      </w:pPr>
+      <w:r>
+        <w:rPr>
+          <w:rFonts w:ascii="IBM Plex Sans Arabic" w:hAnsi="IBM Plex Sans Arabic" w:cs="IBM Plex Sans Arabic"/>
+          <w:rtl/>
+        </w:rPr>
+        <w:t>لم يتحقّق بعد: استكمال بيانات منافسون مرصودون بالاسم وإعادة تقييم القرار — إغلاق هذا الشرط يتطلّب توثيق المدخلات من مصدر مناسب، ثم إعادة الحساب قبل الالتزام بالبيع.</w:t>
+      </w:r>
+    </w:p>
+    <w:p>
+      <w:pPr>
+        <w:pStyle w:val="ListBullet"/>
+        <w:bidi/>
+        <w:jc w:val="start"/>
+      </w:pPr>
+      <w:r>
+        <w:rPr>
+          <w:rFonts w:ascii="IBM Plex Sans Arabic" w:hAnsi="IBM Plex Sans Arabic" w:cs="IBM Plex Sans Arabic"/>
+          <w:rtl/>
+        </w:rPr>
+        <w:t>لم يتحقّق بعد: استكمال بيانات التعريفة الجمركية وإعادة تقييم القرار — إغلاق هذا الشرط يتطلّب توثيق المدخلات من مصدر مناسب، ثم إعادة الحساب قبل الالتزام بالبيع.</w:t>
+      </w:r>
+    </w:p>
+    <w:p>
+      <w:pPr>
+        <w:pStyle w:val="ListBullet"/>
+        <w:bidi/>
+        <w:jc w:val="start"/>
+      </w:pPr>
+      <w:r>
+        <w:rPr>
+          <w:rFonts w:ascii="IBM Plex Sans Arabic" w:hAnsi="IBM Plex Sans Arabic" w:cs="IBM Plex Sans Arabic"/>
+          <w:rtl/>
+        </w:rPr>
+        <w:t>لم يتحقّق بعد: استكمال بيانات هامش السعر عند الحدود وإعادة تقييم القرار — إغلاق هذا الشرط يتطلّب توثيق المدخلات من مصدر مناسب، ثم إعادة الحساب قبل الالتزام بالبيع.</w:t>
+      </w:r>
+    </w:p>
+    <w:p>
+      <w:pPr>
+        <w:pStyle w:val="ListBullet"/>
+        <w:bidi/>
+        <w:jc w:val="start"/>
+      </w:pPr>
+      <w:r>
+        <w:rPr>
+          <w:rFonts w:ascii="IBM Plex Sans Arabic" w:hAnsi="IBM Plex Sans Arabic" w:cs="IBM Plex Sans Arabic"/>
+          <w:rtl/>
+        </w:rPr>
+        <w:t>لم يتحقّق بعد: استكمال بيانات موقع سعرك مقابل السوق وإعادة تقييم القرار — إغلاق هذا الشرط يتطلّب توثيق المدخلات من مصدر مناسب، ثم إعادة الحساب قبل الالتزام بالبيع.</w:t>
+      </w:r>
+    </w:p>
+    <w:p>
+      <w:pPr>
+        <w:pStyle w:val="ListBullet"/>
+        <w:bidi/>
+        <w:jc w:val="start"/>
+      </w:pPr>
+      <w:r>
+        <w:rPr>
+          <w:rFonts w:ascii="IBM Plex Sans Arabic" w:hAnsi="IBM Plex Sans Arabic" w:cs="IBM Plex Sans Arabic"/>
+          <w:rtl/>
+        </w:rPr>
+        <w:t>لم يتحقّق بعد: استكمال بيانات الاستقرار السياسي وإعادة تقييم القرار — إغلاق هذا الشرط يتطلّب توثيق المدخلات من مصدر مناسب، ثم إعادة الحساب قبل الالتزام بالبيع.</w:t>
+      </w:r>
+    </w:p>
+    <w:p>
+      <w:pPr>
+        <w:pStyle w:val="ListBullet"/>
+        <w:bidi/>
+        <w:jc w:val="start"/>
+      </w:pPr>
+      <w:r>
+        <w:rPr>
+          <w:rFonts w:ascii="IBM Plex Sans Arabic" w:hAnsi="IBM Plex Sans Arabic" w:cs="IBM Plex Sans Arabic"/>
+          <w:rtl/>
+        </w:rPr>
+        <w:t>لم يتحقّق بعد: استكمال بيانات جودة التنظيم وإعادة تقييم القرار — إغلاق هذا الشرط يتطلّب توثيق المدخلات من مصدر مناسب، ثم إعادة الحساب قبل الالتزام بالبيع.</w:t>
+      </w:r>
+    </w:p>
+    <w:p>
+      <w:pPr>
+        <w:pStyle w:val="ListBullet"/>
+        <w:bidi/>
+        <w:jc w:val="start"/>
+      </w:pPr>
+      <w:r>
+        <w:rPr>
+          <w:rFonts w:ascii="IBM Plex Sans Arabic" w:hAnsi="IBM Plex Sans Arabic" w:cs="IBM Plex Sans Arabic"/>
+          <w:rtl/>
+        </w:rPr>
+        <w:t>لم يتحقّق بعد: استكمال بيانات أداء اللوجستيات وإعادة تقييم القرار — إغلاق هذا الشرط يتطلّب توثيق المدخلات من مصدر مناسب، ثم إعادة الحساب قبل الالتزام بالبيع.</w:t>
+      </w:r>
+    </w:p>
+    <w:p>
+      <w:pPr>
+        <w:pStyle w:val="ListBullet"/>
+        <w:bidi/>
+        <w:jc w:val="start"/>
+      </w:pPr>
+      <w:r>
+        <w:rPr>
+          <w:rFonts w:ascii="IBM Plex Sans Arabic" w:hAnsi="IBM Plex Sans Arabic" w:cs="IBM Plex Sans Arabic"/>
+          <w:rtl/>
+        </w:rPr>
+        <w:t>لم يتحقّق بعد: استكمال بيانات استقرار العملة وإعادة تقييم القرار — إغلاق هذا الشرط يتطلّب توثيق المدخلات من مصدر مناسب، ثم إعادة الحساب قبل الالتزام بالبيع.</w:t>
       </w:r>
     </w:p>
     <w:p>
@@ -6703,7 +6885,7 @@
                 <w:rFonts w:ascii="IBM Plex Sans Arabic" w:hAnsi="IBM Plex Sans Arabic" w:cs="IBM Plex Sans Arabic"/>
                 <w:rtl/>
               </w:rPr>
-              <w:t>2026-08-26</w:t>
+              <w:t>2026-09-09</w:t>
             </w:r>
           </w:p>
         </w:tc>

</xml_diff>